<commit_message>
fix: proposition title and footer centred
</commit_message>
<xml_diff>
--- a/views/PROPOSITION_TEMPLATE.docx
+++ b/views/PROPOSITION_TEMPLATE.docx
@@ -1404,7 +1404,7 @@
             <wp:anchor distT="0" distB="0" distL="114300" distR="114300" simplePos="0" relativeHeight="251659264" behindDoc="0" locked="0" layoutInCell="1" allowOverlap="1" wp14:anchorId="4D870C26" wp14:editId="4CEE19C4">
               <wp:simplePos x="0" y="0"/>
               <wp:positionH relativeFrom="column">
-                <wp:posOffset>1593850</wp:posOffset>
+                <wp:posOffset>2895065</wp:posOffset>
               </wp:positionH>
               <wp:positionV relativeFrom="paragraph">
                 <wp:posOffset>-93345</wp:posOffset>
@@ -1760,7 +1760,7 @@
             <wp:anchor distT="0" distB="0" distL="114300" distR="114300" simplePos="0" relativeHeight="251661312" behindDoc="0" locked="0" layoutInCell="1" allowOverlap="1" wp14:anchorId="559639FB" wp14:editId="63F16AE2">
               <wp:simplePos x="0" y="0"/>
               <wp:positionH relativeFrom="column">
-                <wp:posOffset>1943100</wp:posOffset>
+                <wp:posOffset>2895065</wp:posOffset>
               </wp:positionH>
               <wp:positionV relativeFrom="paragraph">
                 <wp:posOffset>0</wp:posOffset>

</xml_diff>

<commit_message>
fix: plain centred footer paragraphs for LibreOffice
</commit_message>
<xml_diff>
--- a/views/PROPOSITION_TEMPLATE.docx
+++ b/views/PROPOSITION_TEMPLATE.docx
@@ -1388,730 +1388,214 @@
 </file>
 
 <file path=word/footer1.xml><?xml version="1.0" encoding="utf-8"?>
-<w:ftr xmlns:wpc="http://schemas.microsoft.com/office/word/2010/wordprocessingCanvas" xmlns:cx="http://schemas.microsoft.com/office/drawing/2014/chartex" xmlns:cx1="http://schemas.microsoft.com/office/drawing/2015/9/8/chartex" xmlns:cx2="http://schemas.microsoft.com/office/drawing/2015/10/21/chartex" xmlns:cx3="http://schemas.microsoft.com/office/drawing/2016/5/9/chartex" xmlns:cx4="http://schemas.microsoft.com/office/drawing/2016/5/10/chartex" xmlns:cx5="http://schemas.microsoft.com/office/drawing/2016/5/11/chartex" xmlns:cx6="http://schemas.microsoft.com/office/drawing/2016/5/12/chartex" xmlns:cx7="http://schemas.microsoft.com/office/drawing/2016/5/13/chartex" xmlns:cx8="http://schemas.microsoft.com/office/drawing/2016/5/14/chartex" xmlns:mc="http://schemas.openxmlformats.org/markup-compatibility/2006" xmlns:m="http://schemas.openxmlformats.org/officeDocument/2006/math" xmlns:aink="http://schemas.microsoft.com/office/drawing/2016/ink" xmlns:am3d="http://schemas.microsoft.com/office/drawing/2017/model3d" xmlns:oel="http://schemas.microsoft.com/office/2019/extlst" xmlns:r="http://schemas.openxmlformats.org/officeDocument/2006/relationships" xmlns:wp14="http://schemas.microsoft.com/office/word/2010/wordprocessingDrawing" xmlns:wp="http://schemas.openxmlformats.org/drawingml/2006/wordprocessingDrawing" xmlns:wpg="http://schemas.microsoft.com/office/word/2010/wordprocessingGroup" xmlns:wpi="http://schemas.microsoft.com/office/word/2010/wordprocessingInk" xmlns:wps="http://schemas.microsoft.com/office/word/2010/wordprocessingShape" xmlns:o="urn:schemas-microsoft-com:office:office" xmlns:v="urn:schemas-microsoft-com:vml" xmlns:w10="urn:schemas-microsoft-com:office:word" xmlns:w="http://schemas.openxmlformats.org/wordprocessingml/2006/main" xmlns:w14="http://schemas.microsoft.com/office/word/2010/wordml" xmlns:w15="http://schemas.microsoft.com/office/word/2012/wordml" xmlns:w16cex="http://schemas.microsoft.com/office/word/2018/wordml/cex" xmlns:w16cid="http://schemas.microsoft.com/office/word/2016/wordml/cid" xmlns:w16="http://schemas.microsoft.com/office/word/2018/wordml" xmlns:w16sdtdh="http://schemas.microsoft.com/office/word/2020/wordml/sdtdatahash" xmlns:w16sdtfl="http://schemas.microsoft.com/office/word/2024/wordml/sdtformatlock" xmlns:w16se="http://schemas.microsoft.com/office/word/2015/wordml/symex" xmlns:w16du="http://schemas.microsoft.com/office/word/2023/wordml/word16du" xmlns:wne="http://schemas.microsoft.com/office/word/2006/wordml" mc:Ignorable="w14 w15 w16se w16cid w16 w16cex w16sdtdh w16sdtfl w16du wp14">
+<w:ftr xmlns:w="http://schemas.openxmlformats.org/wordprocessingml/2006/main">
   <w:p>
     <w:pPr>
-      <w:pStyle w:val="Footer"/>
+      <w:jc w:val="center"/>
+      <w:rPr>
+        <w:rFonts w:ascii="Book Antiqua" w:hAnsi="Book Antiqua"/>
+        <w:color w:val="333399"/>
+        <w:sz w:val="15"/>
+        <w:szCs w:val="15"/>
+      </w:rPr>
     </w:pPr>
     <w:r>
       <w:rPr>
-        <w:noProof/>
-        <w:lang w:val="en-US"/>
-      </w:rPr>
-      <mc:AlternateContent>
-        <mc:Choice Requires="wps">
-          <w:drawing>
-            <wp:anchor distT="0" distB="0" distL="114300" distR="114300" simplePos="0" relativeHeight="251659264" behindDoc="0" locked="0" layoutInCell="1" allowOverlap="1" wp14:anchorId="4D870C26" wp14:editId="4CEE19C4">
-              <wp:simplePos x="0" y="0"/>
-              <wp:positionH relativeFrom="column">
-                <wp:posOffset>1593850</wp:posOffset>
-              </wp:positionH>
-              <wp:positionV relativeFrom="paragraph">
-                <wp:posOffset>-93345</wp:posOffset>
-              </wp:positionV>
-              <wp:extent cx="2515870" cy="628015"/>
-              <wp:effectExtent l="0" t="0" r="0" b="0"/>
-              <wp:wrapNone/>
-              <wp:docPr id="292" name="Text Box 292"/>
-              <wp:cNvGraphicFramePr>
-                <a:graphicFrameLocks xmlns:a="http://schemas.openxmlformats.org/drawingml/2006/main"/>
-              </wp:cNvGraphicFramePr>
-              <a:graphic xmlns:a="http://schemas.openxmlformats.org/drawingml/2006/main">
-                <a:graphicData uri="http://schemas.microsoft.com/office/word/2010/wordprocessingShape">
-                  <wps:wsp>
-                    <wps:cNvSpPr txBox="1">
-                      <a:spLocks noChangeArrowheads="1"/>
-                    </wps:cNvSpPr>
-                    <wps:spPr bwMode="auto">
-                      <a:xfrm>
-                        <a:off x="0" y="0"/>
-                        <a:ext cx="2515870" cy="628015"/>
-                      </a:xfrm>
-                      <a:prstGeom prst="rect">
-                        <a:avLst/>
-                      </a:prstGeom>
-                      <a:noFill/>
-                      <a:ln>
-                        <a:noFill/>
-                      </a:ln>
-                      <a:extLst>
-                        <a:ext uri="{909E8E84-426E-40dd-AFC4-6F175D3DCCD1}">
-                          <a14:hiddenFill xmlns:a14="http://schemas.microsoft.com/office/drawing/2010/main" xmlns:w="http://schemas.openxmlformats.org/wordprocessingml/2006/main" xmlns:w10="urn:schemas-microsoft-com:office:word" xmlns:v="urn:schemas-microsoft-com:vml" xmlns:o="urn:schemas-microsoft-com:office:office" xmlns:mv="urn:schemas-microsoft-com:mac:vml" xmlns:mo="http://schemas.microsoft.com/office/mac/office/2008/main" xmlns="">
-                            <a:solidFill>
-                              <a:srgbClr val="00CC99"/>
-                            </a:solidFill>
-                          </a14:hiddenFill>
-                        </a:ext>
-                        <a:ext uri="{91240B29-F687-4f45-9708-019B960494DF}">
-                          <a14:hiddenLine xmlns:a14="http://schemas.microsoft.com/office/drawing/2010/main" xmlns:w="http://schemas.openxmlformats.org/wordprocessingml/2006/main" xmlns:w10="urn:schemas-microsoft-com:office:word" xmlns:v="urn:schemas-microsoft-com:vml" xmlns:o="urn:schemas-microsoft-com:office:office" xmlns:mv="urn:schemas-microsoft-com:mac:vml" xmlns:mo="http://schemas.microsoft.com/office/mac/office/2008/main" xmlns="" w="9525">
-                            <a:solidFill>
-                              <a:srgbClr val="000000"/>
-                            </a:solidFill>
-                            <a:miter lim="800000"/>
-                            <a:headEnd/>
-                            <a:tailEnd/>
-                          </a14:hiddenLine>
-                        </a:ext>
-                      </a:extLst>
-                    </wps:spPr>
-                    <wps:txbx>
-                      <w:txbxContent>
-                        <w:p>
-                          <w:pPr>
-                            <w:pStyle w:val="NormalWeb"/>
-                            <w:spacing w:before="0" w:beforeAutospacing="0" w:after="0" w:afterAutospacing="0"/>
-                            <w:jc w:val="center"/>
-                          </w:pPr>
-                          <w:r>
-                            <w:rPr>
-                              <w:rFonts w:ascii="Book Antiqua" w:hAnsi="Book Antiqua"/>
-                              <w:color w:val="333399"/>
-                              <w:sz w:val="15"/>
-                              <w:szCs w:val="15"/>
-                            </w:rPr>
-                            <w:t>Linguaid France SAS</w:t>
-                          </w:r>
-                        </w:p>
-                        <w:p>
-                          <w:pPr>
-                            <w:pStyle w:val="NormalWeb"/>
-                            <w:spacing w:before="0" w:beforeAutospacing="0" w:after="0" w:afterAutospacing="0"/>
-                            <w:jc w:val="center"/>
-                          </w:pPr>
-                          <w:r>
-                            <w:rPr>
-                              <w:rFonts w:ascii="Book Antiqua" w:hAnsi="Book Antiqua"/>
-                              <w:color w:val="333399"/>
-                              <w:sz w:val="15"/>
-                              <w:szCs w:val="15"/>
-                            </w:rPr>
-                            <w:t>2 rue Hergé, 66750 Saint Cyprien</w:t>
-                          </w:r>
-                        </w:p>
-                        <w:p>
-                          <w:pPr>
-                            <w:pStyle w:val="NormalWeb"/>
-                            <w:spacing w:before="0" w:beforeAutospacing="0" w:after="0" w:afterAutospacing="0"/>
-                            <w:jc w:val="center"/>
-                          </w:pPr>
-                          <w:r>
-                            <w:rPr>
-                              <w:rFonts w:ascii="Book Antiqua" w:hAnsi="Book Antiqua"/>
-                              <w:color w:val="333399"/>
-                              <w:sz w:val="14"/>
-                              <w:szCs w:val="14"/>
-                            </w:rPr>
-                            <w:t xml:space="preserve">RCS </w:t>
-                          </w:r>
-                          <w:r>
-                            <w:rPr>
-                              <w:rFonts w:ascii="Book Antiqua" w:hAnsi="Book Antiqua"/>
-                              <w:color w:val="333399"/>
-                              <w:sz w:val="14"/>
-                              <w:szCs w:val="14"/>
-                            </w:rPr>
-                            <w:t xml:space="preserve">Perpignan B 539 682 187 </w:t>
-                          </w:r>
-                          <w:r>
-                            <w:rPr>
-                              <w:rFonts w:ascii="Book Antiqua" w:hAnsi="Book Antiqua"/>
-                              <w:color w:val="333399"/>
-                              <w:sz w:val="14"/>
-                              <w:szCs w:val="14"/>
-                            </w:rPr>
-                            <w:t>NAF : 8559A</w:t>
-                          </w:r>
-                        </w:p>
-                        <w:p>
-                          <w:pPr>
-                            <w:pStyle w:val="NormalWeb"/>
-                            <w:spacing w:before="0" w:beforeAutospacing="0" w:after="0" w:afterAutospacing="0"/>
-                            <w:jc w:val="center"/>
-                          </w:pPr>
-                          <w:r>
-                            <w:rPr>
-                              <w:rFonts w:ascii="Book Antiqua" w:hAnsi="Book Antiqua"/>
-                              <w:color w:val="333399"/>
-                              <w:sz w:val="14"/>
-                              <w:szCs w:val="14"/>
-                            </w:rPr>
-                            <w:t>Enregistrée sous le numéro : 91 66 01 620 66</w:t>
-                          </w:r>
-                        </w:p>
-                        <w:p>
-                          <w:pPr>
-                            <w:pStyle w:val="NormalWeb"/>
-                            <w:spacing w:before="0" w:beforeAutospacing="0" w:after="0" w:afterAutospacing="0"/>
-                            <w:jc w:val="center"/>
-                          </w:pPr>
-                          <w:r>
-                            <w:rPr>
-                              <w:rFonts w:ascii="Book Antiqua" w:hAnsi="Book Antiqua"/>
-                              <w:i/>
-                              <w:iCs/>
-                              <w:color w:val="333399"/>
-                              <w:sz w:val="14"/>
-                              <w:szCs w:val="14"/>
-                            </w:rPr>
-                            <w:t>Cet enregistrement ne vaut pas agrément de l’Etat</w:t>
-                          </w:r>
-                          <w:r>
-                            <w:rPr>
-                              <w:rFonts w:ascii="Book Antiqua" w:hAnsi="Book Antiqua"/>
-                              <w:color w:val="333399"/>
-                              <w:sz w:val="15"/>
-                              <w:szCs w:val="15"/>
-                            </w:rPr>
-                            <w:t> </w:t>
-                          </w:r>
-                        </w:p>
-                        <w:p>
-                          <w:pPr>
-                            <w:pStyle w:val="NormalWeb"/>
-                            <w:spacing w:before="0" w:beforeAutospacing="0" w:after="0" w:afterAutospacing="0"/>
-                            <w:jc w:val="center"/>
-                          </w:pPr>
-                          <w:r>
-                            <w:rPr>
-                              <w:rFonts w:ascii="Book Antiqua" w:hAnsi="Book Antiqua"/>
-                              <w:color w:val="333399"/>
-                              <w:sz w:val="15"/>
-                              <w:szCs w:val="15"/>
-                            </w:rPr>
-                            <w:t> </w:t>
-                          </w:r>
-                        </w:p>
-                      </w:txbxContent>
-                    </wps:txbx>
-                    <wps:bodyPr rot="0" vert="horz" wrap="square" lIns="91440" tIns="45720" rIns="91440" bIns="45720" anchor="t" anchorCtr="0" upright="1">
-                      <a:noAutofit/>
-                    </wps:bodyPr>
-                  </wps:wsp>
-                </a:graphicData>
-              </a:graphic>
-              <wp14:sizeRelH relativeFrom="page">
-                <wp14:pctWidth>0</wp14:pctWidth>
-              </wp14:sizeRelH>
-              <wp14:sizeRelV relativeFrom="page">
-                <wp14:pctHeight>0</wp14:pctHeight>
-              </wp14:sizeRelV>
-            </wp:anchor>
-          </w:drawing>
-        </mc:Choice>
-        <mc:Fallback>
-          <w:pict>
-            <v:shapetype w14:anchorId="4D870C26" id="_x0000_t202" coordsize="21600,21600" o:spt="202" path="m,l,21600r21600,l21600,xe">
-              <v:stroke joinstyle="miter"/>
-              <v:path gradientshapeok="t" o:connecttype="rect"/>
-            </v:shapetype>
-            <v:shape id="Text Box 292" o:spid="_x0000_s1026" type="#_x0000_t202" style="position:absolute;margin-left:125.5pt;margin-top:-7.35pt;width:198.1pt;height:49.45pt;z-index:251659264;visibility:visible;mso-wrap-style:square;mso-width-percent:0;mso-height-percent:0;mso-wrap-distance-left:9pt;mso-wrap-distance-top:0;mso-wrap-distance-right:9pt;mso-wrap-distance-bottom:0;mso-position-horizontal:absolute;mso-position-horizontal-relative:text;mso-position-vertical:absolute;mso-position-vertical-relative:text;mso-width-percent:0;mso-height-percent:0;mso-width-relative:page;mso-height-relative:page;v-text-anchor:top" o:gfxdata="UEsDBBQABgAIAAAAIQC2gziS/gAAAOEBAAATAAAAW0NvbnRlbnRfVHlwZXNdLnhtbJSRQU7DMBBF 90jcwfIWJU67QAgl6YK0S0CoHGBkTxKLZGx5TGhvj5O2G0SRWNoz/78nu9wcxkFMGNg6quQqL6RA 0s5Y6ir5vt9lD1JwBDIwOMJKHpHlpr69KfdHjyxSmriSfYz+USnWPY7AufNIadK6MEJMx9ApD/oD OlTrorhX2lFEilmcO2RdNtjC5xDF9pCuTyYBB5bi6bQ4syoJ3g9WQ0ymaiLzg5KdCXlKLjvcW893 SUOqXwnz5DrgnHtJTxOsQfEKIT7DmDSUCaxw7Rqn8787ZsmRM9e2VmPeBN4uqYvTtW7jvijg9N/y JsXecLq0q+WD6m8AAAD//wMAUEsDBBQABgAIAAAAIQA4/SH/1gAAAJQBAAALAAAAX3JlbHMvLnJl bHOkkMFqwzAMhu+DvYPRfXGawxijTi+j0GvpHsDYimMaW0Yy2fr2M4PBMnrbUb/Q94l/f/hMi1qR JVI2sOt6UJgd+ZiDgffL8ekFlFSbvV0oo4EbChzGx4f9GRdb25HMsYhqlCwG5lrLq9biZkxWOiqY 22YiTra2kYMu1l1tQD30/bPm3wwYN0x18gb45AdQl1tp5j/sFB2T0FQ7R0nTNEV3j6o9feQzro1i OWA14Fm+Q8a1a8+Bvu/d/dMb2JY5uiPbhG/ktn4cqGU/er3pcvwCAAD//wMAUEsDBBQABgAIAAAA IQDkASDR4AEAAKEDAAAOAAAAZHJzL2Uyb0RvYy54bWysU9tu2zAMfR+wfxD0vjg2kjYz4hRdiw4D ugvQ7QNkWbKF2aJGKbGzrx8lp2m2vQ17ESSSPjznkN7eTEPPDgq9AVvxfLHkTFkJjbFtxb99fXiz 4cwHYRvRg1UVPyrPb3avX21HV6oCOugbhYxArC9HV/EuBFdmmZedGoRfgFOWkhpwEIGe2GYNipHQ hz4rlsurbARsHIJU3lP0fk7yXcLXWsnwWWuvAusrTtxCOjGddTyz3VaULQrXGXmiIf6BxSCMpaZn qHsRBNuj+QtqMBLBgw4LCUMGWhupkgZSky//UPPUCaeSFjLHu7NN/v/Byk+HJ/cFWZjewUQDTCK8 ewT53TMLd52wrbpFhLFToqHGebQsG50vT59Gq33pI0g9foSGhiz2ARLQpHGIrpBORug0gOPZdDUF JilYrPP15ppSknJXxWaZr1MLUT5/7dCH9woGFi8VRxpqQheHRx8iG1E+l8RmFh5M36fB9va3ABXG SGIfCc/Uw1RPVB1V1NAcSQfCvCe013TpAH9yNtKOVNz/2AtUnPUfLHnxNl+t4lKlx2p9XdADLzP1 ZUZYSVAVD5zN17swL+LeoWk76jS7b+GW/NMmSXthdeJNe5AUn3Y2LtrlO1W9/Fm7XwAAAP//AwBQ SwMEFAAGAAgAAAAhAOf1L43kAAAADwEAAA8AAABkcnMvZG93bnJldi54bWxMj0tPwzAQhO9I/Adr kbi1dqL0QZpNhai4gigPiZsbb5OIeB3FbhP+Pe6pXFYa7e7MfMV2sp040+BbxwjJXIEgrpxpuUb4 eH+erUH4oNnozjEh/JKHbXl7U+jcuJHf6LwPtYgm7HON0ITQ51L6qiGr/dz1xHF3dIPVIcqhlmbQ YzS3nUyVWkqrW44Jje7pqaHqZ3+yCJ8vx++vTL3WO7voRzcpyfZBIt7fTbtNHI8bEIGmcP2AC0Ps D2UsdnAnNl50COkiiUABYZZkKxDxYpmtUhAHhHWWgiwL+Z+j/AMAAP//AwBQSwECLQAUAAYACAAA ACEAtoM4kv4AAADhAQAAEwAAAAAAAAAAAAAAAAAAAAAAW0NvbnRlbnRfVHlwZXNdLnhtbFBLAQIt ABQABgAIAAAAIQA4/SH/1gAAAJQBAAALAAAAAAAAAAAAAAAAAC8BAABfcmVscy8ucmVsc1BLAQIt ABQABgAIAAAAIQDkASDR4AEAAKEDAAAOAAAAAAAAAAAAAAAAAC4CAABkcnMvZTJvRG9jLnhtbFBL AQItABQABgAIAAAAIQDn9S+N5AAAAA8BAAAPAAAAAAAAAAAAAAAAADoEAABkcnMvZG93bnJldi54 bWxQSwUGAAAAAAQABADzAAAASwUAAAAA " filled="f" stroked="f">
-              <v:textbox>
-                <w:txbxContent>
-                  <w:p>
-                    <w:pPr>
-                      <w:pStyle w:val="NormalWeb"/>
-                      <w:spacing w:before="0" w:beforeAutospacing="0" w:after="0" w:afterAutospacing="0"/>
-                      <w:jc w:val="center"/>
-                    </w:pPr>
-                    <w:r>
-                      <w:rPr>
-                        <w:rFonts w:ascii="Book Antiqua" w:hAnsi="Book Antiqua"/>
-                        <w:color w:val="333399"/>
-                        <w:sz w:val="15"/>
-                        <w:szCs w:val="15"/>
-                      </w:rPr>
-                      <w:t>Linguaid France SAS</w:t>
-                    </w:r>
-                  </w:p>
-                  <w:p>
-                    <w:pPr>
-                      <w:pStyle w:val="NormalWeb"/>
-                      <w:spacing w:before="0" w:beforeAutospacing="0" w:after="0" w:afterAutospacing="0"/>
-                      <w:jc w:val="center"/>
-                    </w:pPr>
-                    <w:r>
-                      <w:rPr>
-                        <w:rFonts w:ascii="Book Antiqua" w:hAnsi="Book Antiqua"/>
-                        <w:color w:val="333399"/>
-                        <w:sz w:val="15"/>
-                        <w:szCs w:val="15"/>
-                      </w:rPr>
-                      <w:t>2 rue Hergé, 66750 Saint Cyprien</w:t>
-                    </w:r>
-                  </w:p>
-                  <w:p>
-                    <w:pPr>
-                      <w:pStyle w:val="NormalWeb"/>
-                      <w:spacing w:before="0" w:beforeAutospacing="0" w:after="0" w:afterAutospacing="0"/>
-                      <w:jc w:val="center"/>
-                    </w:pPr>
-                    <w:r>
-                      <w:rPr>
-                        <w:rFonts w:ascii="Book Antiqua" w:hAnsi="Book Antiqua"/>
-                        <w:color w:val="333399"/>
-                        <w:sz w:val="14"/>
-                        <w:szCs w:val="14"/>
-                      </w:rPr>
-                      <w:t xml:space="preserve">RCS </w:t>
-                    </w:r>
-                    <w:r>
-                      <w:rPr>
-                        <w:rFonts w:ascii="Book Antiqua" w:hAnsi="Book Antiqua"/>
-                        <w:color w:val="333399"/>
-                        <w:sz w:val="14"/>
-                        <w:szCs w:val="14"/>
-                      </w:rPr>
-                      <w:t xml:space="preserve">Perpignan B 539 682 187 </w:t>
-                    </w:r>
-                    <w:r>
-                      <w:rPr>
-                        <w:rFonts w:ascii="Book Antiqua" w:hAnsi="Book Antiqua"/>
-                        <w:color w:val="333399"/>
-                        <w:sz w:val="14"/>
-                        <w:szCs w:val="14"/>
-                      </w:rPr>
-                      <w:t>NAF : 8559A</w:t>
-                    </w:r>
-                  </w:p>
-                  <w:p>
-                    <w:pPr>
-                      <w:pStyle w:val="NormalWeb"/>
-                      <w:spacing w:before="0" w:beforeAutospacing="0" w:after="0" w:afterAutospacing="0"/>
-                      <w:jc w:val="center"/>
-                    </w:pPr>
-                    <w:r>
-                      <w:rPr>
-                        <w:rFonts w:ascii="Book Antiqua" w:hAnsi="Book Antiqua"/>
-                        <w:color w:val="333399"/>
-                        <w:sz w:val="14"/>
-                        <w:szCs w:val="14"/>
-                      </w:rPr>
-                      <w:t>Enregistrée sous le numéro : 91 66 01 620 66</w:t>
-                    </w:r>
-                  </w:p>
-                  <w:p>
-                    <w:pPr>
-                      <w:pStyle w:val="NormalWeb"/>
-                      <w:spacing w:before="0" w:beforeAutospacing="0" w:after="0" w:afterAutospacing="0"/>
-                      <w:jc w:val="center"/>
-                    </w:pPr>
-                    <w:r>
-                      <w:rPr>
-                        <w:rFonts w:ascii="Book Antiqua" w:hAnsi="Book Antiqua"/>
-                        <w:i/>
-                        <w:iCs/>
-                        <w:color w:val="333399"/>
-                        <w:sz w:val="14"/>
-                        <w:szCs w:val="14"/>
-                      </w:rPr>
-                      <w:t>Cet enregistrement ne vaut pas agrément de l’Etat</w:t>
-                    </w:r>
-                    <w:r>
-                      <w:rPr>
-                        <w:rFonts w:ascii="Book Antiqua" w:hAnsi="Book Antiqua"/>
-                        <w:color w:val="333399"/>
-                        <w:sz w:val="15"/>
-                        <w:szCs w:val="15"/>
-                      </w:rPr>
-                      <w:t> </w:t>
-                    </w:r>
-                  </w:p>
-                  <w:p>
-                    <w:pPr>
-                      <w:pStyle w:val="NormalWeb"/>
-                      <w:spacing w:before="0" w:beforeAutospacing="0" w:after="0" w:afterAutospacing="0"/>
-                      <w:jc w:val="center"/>
-                    </w:pPr>
-                    <w:r>
-                      <w:rPr>
-                        <w:rFonts w:ascii="Book Antiqua" w:hAnsi="Book Antiqua"/>
-                        <w:color w:val="333399"/>
-                        <w:sz w:val="15"/>
-                        <w:szCs w:val="15"/>
-                      </w:rPr>
-                      <w:t> </w:t>
-                    </w:r>
-                  </w:p>
-                </w:txbxContent>
-              </v:textbox>
-            </v:shape>
-          </w:pict>
-        </mc:Fallback>
-      </mc:AlternateContent>
+        <w:rFonts w:ascii="Book Antiqua" w:hAnsi="Book Antiqua"/>
+        <w:color w:val="333399"/>
+        <w:sz w:val="15"/>
+        <w:szCs w:val="15"/>
+      </w:rPr>
+      <w:t>Linguaid France SAS</w:t>
+    </w:r>
+  </w:p>
+  <w:p>
+    <w:pPr>
+      <w:jc w:val="center"/>
+      <w:rPr>
+        <w:rFonts w:ascii="Book Antiqua" w:hAnsi="Book Antiqua"/>
+        <w:color w:val="333399"/>
+        <w:sz w:val="15"/>
+        <w:szCs w:val="15"/>
+      </w:rPr>
+    </w:pPr>
+    <w:r>
+      <w:rPr>
+        <w:rFonts w:ascii="Book Antiqua" w:hAnsi="Book Antiqua"/>
+        <w:color w:val="333399"/>
+        <w:sz w:val="15"/>
+        <w:szCs w:val="15"/>
+      </w:rPr>
+      <w:t>2 rue Hergé, 66750 Saint Cyprien</w:t>
+    </w:r>
+  </w:p>
+  <w:p>
+    <w:pPr>
+      <w:jc w:val="center"/>
+      <w:rPr>
+        <w:rFonts w:ascii="Book Antiqua" w:hAnsi="Book Antiqua"/>
+        <w:color w:val="333399"/>
+        <w:sz w:val="14"/>
+        <w:szCs w:val="14"/>
+      </w:rPr>
+    </w:pPr>
+    <w:r>
+      <w:rPr>
+        <w:rFonts w:ascii="Book Antiqua" w:hAnsi="Book Antiqua"/>
+        <w:color w:val="333399"/>
+        <w:sz w:val="14"/>
+        <w:szCs w:val="14"/>
+      </w:rPr>
+      <w:t>RCS Perpignan B 539 682 187 NAF : 8559A</w:t>
+    </w:r>
+  </w:p>
+  <w:p>
+    <w:pPr>
+      <w:jc w:val="center"/>
+      <w:rPr>
+        <w:rFonts w:ascii="Book Antiqua" w:hAnsi="Book Antiqua"/>
+        <w:color w:val="333399"/>
+        <w:sz w:val="14"/>
+        <w:szCs w:val="14"/>
+      </w:rPr>
+    </w:pPr>
+    <w:r>
+      <w:rPr>
+        <w:rFonts w:ascii="Book Antiqua" w:hAnsi="Book Antiqua"/>
+        <w:color w:val="333399"/>
+        <w:sz w:val="14"/>
+        <w:szCs w:val="14"/>
+      </w:rPr>
+      <w:t>Enregistrée sous le numéro : 91 66 01 620 66</w:t>
+    </w:r>
+  </w:p>
+  <w:p>
+    <w:pPr>
+      <w:jc w:val="center"/>
+      <w:rPr>
+        <w:rFonts w:ascii="Book Antiqua" w:hAnsi="Book Antiqua"/>
+        <w:i/>
+        <w:color w:val="333399"/>
+        <w:sz w:val="14"/>
+        <w:szCs w:val="14"/>
+      </w:rPr>
+    </w:pPr>
+    <w:r>
+      <w:rPr>
+        <w:rFonts w:ascii="Book Antiqua" w:hAnsi="Book Antiqua"/>
+        <w:i/>
+        <w:color w:val="333399"/>
+        <w:sz w:val="14"/>
+        <w:szCs w:val="14"/>
+      </w:rPr>
+      <w:t>Cet enregistrement ne vaut pas agrément de l’Etat</w:t>
     </w:r>
   </w:p>
 </w:ftr>
 </file>
 
 <file path=word/footer2.xml><?xml version="1.0" encoding="utf-8"?>
-<w:ftr xmlns:wpc="http://schemas.microsoft.com/office/word/2010/wordprocessingCanvas" xmlns:cx="http://schemas.microsoft.com/office/drawing/2014/chartex" xmlns:cx1="http://schemas.microsoft.com/office/drawing/2015/9/8/chartex" xmlns:cx2="http://schemas.microsoft.com/office/drawing/2015/10/21/chartex" xmlns:cx3="http://schemas.microsoft.com/office/drawing/2016/5/9/chartex" xmlns:cx4="http://schemas.microsoft.com/office/drawing/2016/5/10/chartex" xmlns:cx5="http://schemas.microsoft.com/office/drawing/2016/5/11/chartex" xmlns:cx6="http://schemas.microsoft.com/office/drawing/2016/5/12/chartex" xmlns:cx7="http://schemas.microsoft.com/office/drawing/2016/5/13/chartex" xmlns:cx8="http://schemas.microsoft.com/office/drawing/2016/5/14/chartex" xmlns:mc="http://schemas.openxmlformats.org/markup-compatibility/2006" xmlns:m="http://schemas.openxmlformats.org/officeDocument/2006/math" xmlns:aink="http://schemas.microsoft.com/office/drawing/2016/ink" xmlns:am3d="http://schemas.microsoft.com/office/drawing/2017/model3d" xmlns:oel="http://schemas.microsoft.com/office/2019/extlst" xmlns:r="http://schemas.openxmlformats.org/officeDocument/2006/relationships" xmlns:wp14="http://schemas.microsoft.com/office/word/2010/wordprocessingDrawing" xmlns:wp="http://schemas.openxmlformats.org/drawingml/2006/wordprocessingDrawing" xmlns:wpg="http://schemas.microsoft.com/office/word/2010/wordprocessingGroup" xmlns:wpi="http://schemas.microsoft.com/office/word/2010/wordprocessingInk" xmlns:wps="http://schemas.microsoft.com/office/word/2010/wordprocessingShape" xmlns:o="urn:schemas-microsoft-com:office:office" xmlns:v="urn:schemas-microsoft-com:vml" xmlns:w10="urn:schemas-microsoft-com:office:word" xmlns:w="http://schemas.openxmlformats.org/wordprocessingml/2006/main" xmlns:w14="http://schemas.microsoft.com/office/word/2010/wordml" xmlns:w15="http://schemas.microsoft.com/office/word/2012/wordml" xmlns:w16cex="http://schemas.microsoft.com/office/word/2018/wordml/cex" xmlns:w16cid="http://schemas.microsoft.com/office/word/2016/wordml/cid" xmlns:w16="http://schemas.microsoft.com/office/word/2018/wordml" xmlns:w16sdtdh="http://schemas.microsoft.com/office/word/2020/wordml/sdtdatahash" xmlns:w16sdtfl="http://schemas.microsoft.com/office/word/2024/wordml/sdtformatlock" xmlns:w16se="http://schemas.microsoft.com/office/word/2015/wordml/symex" xmlns:w16du="http://schemas.microsoft.com/office/word/2023/wordml/word16du" xmlns:wne="http://schemas.microsoft.com/office/word/2006/wordml" mc:Ignorable="w14 w15 w16se w16cid w16 w16cex w16sdtdh w16sdtfl w16du wp14">
+<w:ftr xmlns:w="http://schemas.openxmlformats.org/wordprocessingml/2006/main">
   <w:p>
     <w:pPr>
-      <w:pStyle w:val="Footer"/>
+      <w:jc w:val="center"/>
+      <w:rPr>
+        <w:rFonts w:ascii="Book Antiqua" w:hAnsi="Book Antiqua"/>
+        <w:color w:val="333399"/>
+        <w:sz w:val="15"/>
+        <w:szCs w:val="15"/>
+      </w:rPr>
     </w:pPr>
     <w:r>
       <w:rPr>
-        <w:noProof/>
-        <w:lang w:val="en-US"/>
-      </w:rPr>
-      <mc:AlternateContent>
-        <mc:Choice Requires="wps">
-          <w:drawing>
-            <wp:anchor distT="0" distB="0" distL="114300" distR="114300" simplePos="0" relativeHeight="251661312" behindDoc="0" locked="0" layoutInCell="1" allowOverlap="1" wp14:anchorId="559639FB" wp14:editId="63F16AE2">
-              <wp:simplePos x="0" y="0"/>
-              <wp:positionH relativeFrom="column">
-                <wp:posOffset>1943100</wp:posOffset>
-              </wp:positionH>
-              <wp:positionV relativeFrom="paragraph">
-                <wp:posOffset>0</wp:posOffset>
-              </wp:positionV>
-              <wp:extent cx="2515870" cy="780415"/>
-              <wp:effectExtent l="0" t="0" r="0" b="0"/>
-              <wp:wrapNone/>
-              <wp:docPr id="733162137" name="Text Box 733162137"/>
-              <wp:cNvGraphicFramePr>
-                <a:graphicFrameLocks xmlns:a="http://schemas.openxmlformats.org/drawingml/2006/main"/>
-              </wp:cNvGraphicFramePr>
-              <a:graphic xmlns:a="http://schemas.openxmlformats.org/drawingml/2006/main">
-                <a:graphicData uri="http://schemas.microsoft.com/office/word/2010/wordprocessingShape">
-                  <wps:wsp>
-                    <wps:cNvSpPr txBox="1">
-                      <a:spLocks noChangeArrowheads="1"/>
-                    </wps:cNvSpPr>
-                    <wps:spPr bwMode="auto">
-                      <a:xfrm>
-                        <a:off x="0" y="0"/>
-                        <a:ext cx="2515870" cy="780415"/>
-                      </a:xfrm>
-                      <a:prstGeom prst="rect">
-                        <a:avLst/>
-                      </a:prstGeom>
-                      <a:noFill/>
-                      <a:ln>
-                        <a:noFill/>
-                      </a:ln>
-                      <a:extLst>
-                        <a:ext uri="{909E8E84-426E-40dd-AFC4-6F175D3DCCD1}">
-                          <a14:hiddenFill xmlns:a14="http://schemas.microsoft.com/office/drawing/2010/main" xmlns:w="http://schemas.openxmlformats.org/wordprocessingml/2006/main" xmlns:w10="urn:schemas-microsoft-com:office:word" xmlns:v="urn:schemas-microsoft-com:vml" xmlns:o="urn:schemas-microsoft-com:office:office" xmlns:mv="urn:schemas-microsoft-com:mac:vml" xmlns:mo="http://schemas.microsoft.com/office/mac/office/2008/main" xmlns="">
-                            <a:solidFill>
-                              <a:srgbClr val="00CC99"/>
-                            </a:solidFill>
-                          </a14:hiddenFill>
-                        </a:ext>
-                        <a:ext uri="{91240B29-F687-4f45-9708-019B960494DF}">
-                          <a14:hiddenLine xmlns:a14="http://schemas.microsoft.com/office/drawing/2010/main" xmlns:w="http://schemas.openxmlformats.org/wordprocessingml/2006/main" xmlns:w10="urn:schemas-microsoft-com:office:word" xmlns:v="urn:schemas-microsoft-com:vml" xmlns:o="urn:schemas-microsoft-com:office:office" xmlns:mv="urn:schemas-microsoft-com:mac:vml" xmlns:mo="http://schemas.microsoft.com/office/mac/office/2008/main" xmlns="" w="9525">
-                            <a:solidFill>
-                              <a:srgbClr val="000000"/>
-                            </a:solidFill>
-                            <a:miter lim="800000"/>
-                            <a:headEnd/>
-                            <a:tailEnd/>
-                          </a14:hiddenLine>
-                        </a:ext>
-                      </a:extLst>
-                    </wps:spPr>
-                    <wps:txbx>
-                      <w:txbxContent>
-                        <w:p>
-                          <w:pPr>
-                            <w:pStyle w:val="NormalWeb"/>
-                            <w:spacing w:before="0" w:beforeAutospacing="0" w:after="0" w:afterAutospacing="0"/>
-                            <w:jc w:val="center"/>
-                            <w:rPr>
-                              <w:sz w:val="14"/>
-                              <w:szCs w:val="14"/>
-                            </w:rPr>
-                          </w:pPr>
-                          <w:r>
-                            <w:rPr>
-                              <w:rFonts w:ascii="Book Antiqua" w:hAnsi="Book Antiqua"/>
-                              <w:color w:val="333399"/>
-                              <w:sz w:val="14"/>
-                              <w:szCs w:val="14"/>
-                            </w:rPr>
-                            <w:t>Linguaid France SAS</w:t>
-                          </w:r>
-                        </w:p>
-                        <w:p>
-                          <w:pPr>
-                            <w:pStyle w:val="NormalWeb"/>
-                            <w:spacing w:before="0" w:beforeAutospacing="0" w:after="0" w:afterAutospacing="0"/>
-                            <w:jc w:val="center"/>
-                            <w:rPr>
-                              <w:sz w:val="14"/>
-                              <w:szCs w:val="14"/>
-                            </w:rPr>
-                          </w:pPr>
-                          <w:r>
-                            <w:rPr>
-                              <w:rFonts w:ascii="Book Antiqua" w:hAnsi="Book Antiqua"/>
-                              <w:color w:val="333399"/>
-                              <w:sz w:val="14"/>
-                              <w:szCs w:val="14"/>
-                            </w:rPr>
-                            <w:t>2 rue Hergé, 66750 Saint Cyprien</w:t>
-                          </w:r>
-                        </w:p>
-                        <w:p>
-                          <w:pPr>
-                            <w:pStyle w:val="NormalWeb"/>
-                            <w:spacing w:before="0" w:beforeAutospacing="0" w:after="0" w:afterAutospacing="0"/>
-                            <w:jc w:val="center"/>
-                            <w:rPr>
-                              <w:sz w:val="14"/>
-                              <w:szCs w:val="14"/>
-                            </w:rPr>
-                          </w:pPr>
-                          <w:r>
-                            <w:rPr>
-                              <w:rFonts w:ascii="Book Antiqua" w:hAnsi="Book Antiqua"/>
-                              <w:color w:val="333399"/>
-                              <w:sz w:val="14"/>
-                              <w:szCs w:val="14"/>
-                            </w:rPr>
-                            <w:t>RCS Perpignan B 539 682 187 NAF : 8559A</w:t>
-                          </w:r>
-                        </w:p>
-                        <w:p>
-                          <w:pPr>
-                            <w:pStyle w:val="NormalWeb"/>
-                            <w:spacing w:before="0" w:beforeAutospacing="0" w:after="0" w:afterAutospacing="0"/>
-                            <w:jc w:val="center"/>
-                            <w:rPr>
-                              <w:sz w:val="14"/>
-                              <w:szCs w:val="14"/>
-                            </w:rPr>
-                          </w:pPr>
-                          <w:r>
-                            <w:rPr>
-                              <w:rFonts w:ascii="Book Antiqua" w:hAnsi="Book Antiqua"/>
-                              <w:color w:val="333399"/>
-                              <w:sz w:val="14"/>
-                              <w:szCs w:val="14"/>
-                            </w:rPr>
-                            <w:t>Enregistrée sous le numéro : 91 66 01 620 66</w:t>
-                          </w:r>
-                        </w:p>
-                        <w:p>
-                          <w:pPr>
-                            <w:pStyle w:val="NormalWeb"/>
-                            <w:spacing w:before="0" w:beforeAutospacing="0" w:after="0" w:afterAutospacing="0"/>
-                            <w:jc w:val="center"/>
-                            <w:rPr>
-                              <w:sz w:val="14"/>
-                              <w:szCs w:val="14"/>
-                            </w:rPr>
-                          </w:pPr>
-                          <w:r>
-                            <w:rPr>
-                              <w:rFonts w:ascii="Book Antiqua" w:hAnsi="Book Antiqua"/>
-                              <w:i/>
-                              <w:iCs/>
-                              <w:color w:val="333399"/>
-                              <w:sz w:val="14"/>
-                              <w:szCs w:val="14"/>
-                            </w:rPr>
-                            <w:t>Cet enregistrement ne vaut pas agrément de l’Etat</w:t>
-                          </w:r>
-                        </w:p>
-                        <w:p>
-                          <w:pPr>
-                            <w:pStyle w:val="NormalWeb"/>
-                            <w:spacing w:before="0" w:beforeAutospacing="0" w:after="0" w:afterAutospacing="0"/>
-                            <w:jc w:val="center"/>
-                          </w:pPr>
-                          <w:r>
-                            <w:rPr>
-                              <w:rFonts w:ascii="Book Antiqua" w:hAnsi="Book Antiqua"/>
-                              <w:color w:val="333399"/>
-                              <w:sz w:val="15"/>
-                              <w:szCs w:val="15"/>
-                            </w:rPr>
-                            <w:t> </w:t>
-                          </w:r>
-                        </w:p>
-                        <w:p>
-                          <w:pPr>
-                            <w:pStyle w:val="NormalWeb"/>
-                            <w:spacing w:before="0" w:beforeAutospacing="0" w:after="0" w:afterAutospacing="0"/>
-                            <w:jc w:val="center"/>
-                          </w:pPr>
-                          <w:r>
-                            <w:rPr>
-                              <w:rFonts w:ascii="Book Antiqua" w:hAnsi="Book Antiqua"/>
-                              <w:color w:val="333399"/>
-                              <w:sz w:val="15"/>
-                              <w:szCs w:val="15"/>
-                            </w:rPr>
-                            <w:t> </w:t>
-                          </w:r>
-                        </w:p>
-                      </w:txbxContent>
-                    </wps:txbx>
-                    <wps:bodyPr rot="0" vert="horz" wrap="square" lIns="91440" tIns="45720" rIns="91440" bIns="45720" anchor="t" anchorCtr="0" upright="1">
-                      <a:noAutofit/>
-                    </wps:bodyPr>
-                  </wps:wsp>
-                </a:graphicData>
-              </a:graphic>
-              <wp14:sizeRelH relativeFrom="page">
-                <wp14:pctWidth>0</wp14:pctWidth>
-              </wp14:sizeRelH>
-              <wp14:sizeRelV relativeFrom="page">
-                <wp14:pctHeight>0</wp14:pctHeight>
-              </wp14:sizeRelV>
-            </wp:anchor>
-          </w:drawing>
-        </mc:Choice>
-        <mc:Fallback>
-          <w:pict>
-            <v:shapetype w14:anchorId="559639FB" id="_x0000_t202" coordsize="21600,21600" o:spt="202" path="m,l,21600r21600,l21600,xe">
-              <v:stroke joinstyle="miter"/>
-              <v:path gradientshapeok="t" o:connecttype="rect"/>
-            </v:shapetype>
-            <v:shape id="Text Box 733162137" o:spid="_x0000_s1027" type="#_x0000_t202" style="position:absolute;margin-left:153pt;margin-top:0;width:198.1pt;height:61.45pt;z-index:251661312;visibility:visible;mso-wrap-style:square;mso-width-percent:0;mso-height-percent:0;mso-wrap-distance-left:9pt;mso-wrap-distance-top:0;mso-wrap-distance-right:9pt;mso-wrap-distance-bottom:0;mso-position-horizontal:absolute;mso-position-horizontal-relative:text;mso-position-vertical:absolute;mso-position-vertical-relative:text;mso-width-percent:0;mso-height-percent:0;mso-width-relative:page;mso-height-relative:page;v-text-anchor:top" o:gfxdata="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" filled="f" stroked="f">
-              <v:textbox>
-                <w:txbxContent>
-                  <w:p>
-                    <w:pPr>
-                      <w:pStyle w:val="NormalWeb"/>
-                      <w:spacing w:before="0" w:beforeAutospacing="0" w:after="0" w:afterAutospacing="0"/>
-                      <w:jc w:val="center"/>
-                      <w:rPr>
-                        <w:sz w:val="14"/>
-                        <w:szCs w:val="14"/>
-                      </w:rPr>
-                    </w:pPr>
-                    <w:r>
-                      <w:rPr>
-                        <w:rFonts w:ascii="Book Antiqua" w:hAnsi="Book Antiqua"/>
-                        <w:color w:val="333399"/>
-                        <w:sz w:val="14"/>
-                        <w:szCs w:val="14"/>
-                      </w:rPr>
-                      <w:t>Linguaid France SAS</w:t>
-                    </w:r>
-                  </w:p>
-                  <w:p>
-                    <w:pPr>
-                      <w:pStyle w:val="NormalWeb"/>
-                      <w:spacing w:before="0" w:beforeAutospacing="0" w:after="0" w:afterAutospacing="0"/>
-                      <w:jc w:val="center"/>
-                      <w:rPr>
-                        <w:sz w:val="14"/>
-                        <w:szCs w:val="14"/>
-                      </w:rPr>
-                    </w:pPr>
-                    <w:r>
-                      <w:rPr>
-                        <w:rFonts w:ascii="Book Antiqua" w:hAnsi="Book Antiqua"/>
-                        <w:color w:val="333399"/>
-                        <w:sz w:val="14"/>
-                        <w:szCs w:val="14"/>
-                      </w:rPr>
-                      <w:t>2 rue Hergé, 66750 Saint Cyprien</w:t>
-                    </w:r>
-                  </w:p>
-                  <w:p>
-                    <w:pPr>
-                      <w:pStyle w:val="NormalWeb"/>
-                      <w:spacing w:before="0" w:beforeAutospacing="0" w:after="0" w:afterAutospacing="0"/>
-                      <w:jc w:val="center"/>
-                      <w:rPr>
-                        <w:sz w:val="14"/>
-                        <w:szCs w:val="14"/>
-                      </w:rPr>
-                    </w:pPr>
-                    <w:r>
-                      <w:rPr>
-                        <w:rFonts w:ascii="Book Antiqua" w:hAnsi="Book Antiqua"/>
-                        <w:color w:val="333399"/>
-                        <w:sz w:val="14"/>
-                        <w:szCs w:val="14"/>
-                      </w:rPr>
-                      <w:t>RCS Perpignan B 539 682 187 NAF : 8559A</w:t>
-                    </w:r>
-                  </w:p>
-                  <w:p>
-                    <w:pPr>
-                      <w:pStyle w:val="NormalWeb"/>
-                      <w:spacing w:before="0" w:beforeAutospacing="0" w:after="0" w:afterAutospacing="0"/>
-                      <w:jc w:val="center"/>
-                      <w:rPr>
-                        <w:sz w:val="14"/>
-                        <w:szCs w:val="14"/>
-                      </w:rPr>
-                    </w:pPr>
-                    <w:r>
-                      <w:rPr>
-                        <w:rFonts w:ascii="Book Antiqua" w:hAnsi="Book Antiqua"/>
-                        <w:color w:val="333399"/>
-                        <w:sz w:val="14"/>
-                        <w:szCs w:val="14"/>
-                      </w:rPr>
-                      <w:t>Enregistrée sous le numéro : 91 66 01 620 66</w:t>
-                    </w:r>
-                  </w:p>
-                  <w:p>
-                    <w:pPr>
-                      <w:pStyle w:val="NormalWeb"/>
-                      <w:spacing w:before="0" w:beforeAutospacing="0" w:after="0" w:afterAutospacing="0"/>
-                      <w:jc w:val="center"/>
-                      <w:rPr>
-                        <w:sz w:val="14"/>
-                        <w:szCs w:val="14"/>
-                      </w:rPr>
-                    </w:pPr>
-                    <w:r>
-                      <w:rPr>
-                        <w:rFonts w:ascii="Book Antiqua" w:hAnsi="Book Antiqua"/>
-                        <w:i/>
-                        <w:iCs/>
-                        <w:color w:val="333399"/>
-                        <w:sz w:val="14"/>
-                        <w:szCs w:val="14"/>
-                      </w:rPr>
-                      <w:t>Cet enregistrement ne vaut pas agrément de l’Etat</w:t>
-                    </w:r>
-                  </w:p>
-                  <w:p>
-                    <w:pPr>
-                      <w:pStyle w:val="NormalWeb"/>
-                      <w:spacing w:before="0" w:beforeAutospacing="0" w:after="0" w:afterAutospacing="0"/>
-                      <w:jc w:val="center"/>
-                    </w:pPr>
-                    <w:r>
-                      <w:rPr>
-                        <w:rFonts w:ascii="Book Antiqua" w:hAnsi="Book Antiqua"/>
-                        <w:color w:val="333399"/>
-                        <w:sz w:val="15"/>
-                        <w:szCs w:val="15"/>
-                      </w:rPr>
-                      <w:t> </w:t>
-                    </w:r>
-                  </w:p>
-                  <w:p>
-                    <w:pPr>
-                      <w:pStyle w:val="NormalWeb"/>
-                      <w:spacing w:before="0" w:beforeAutospacing="0" w:after="0" w:afterAutospacing="0"/>
-                      <w:jc w:val="center"/>
-                    </w:pPr>
-                    <w:r>
-                      <w:rPr>
-                        <w:rFonts w:ascii="Book Antiqua" w:hAnsi="Book Antiqua"/>
-                        <w:color w:val="333399"/>
-                        <w:sz w:val="15"/>
-                        <w:szCs w:val="15"/>
-                      </w:rPr>
-                      <w:t> </w:t>
-                    </w:r>
-                  </w:p>
-                </w:txbxContent>
-              </v:textbox>
-            </v:shape>
-          </w:pict>
-        </mc:Fallback>
-      </mc:AlternateContent>
+        <w:rFonts w:ascii="Book Antiqua" w:hAnsi="Book Antiqua"/>
+        <w:color w:val="333399"/>
+        <w:sz w:val="15"/>
+        <w:szCs w:val="15"/>
+      </w:rPr>
+      <w:t>Linguaid France SAS</w:t>
+    </w:r>
+  </w:p>
+  <w:p>
+    <w:pPr>
+      <w:jc w:val="center"/>
+      <w:rPr>
+        <w:rFonts w:ascii="Book Antiqua" w:hAnsi="Book Antiqua"/>
+        <w:color w:val="333399"/>
+        <w:sz w:val="15"/>
+        <w:szCs w:val="15"/>
+      </w:rPr>
+    </w:pPr>
+    <w:r>
+      <w:rPr>
+        <w:rFonts w:ascii="Book Antiqua" w:hAnsi="Book Antiqua"/>
+        <w:color w:val="333399"/>
+        <w:sz w:val="15"/>
+        <w:szCs w:val="15"/>
+      </w:rPr>
+      <w:t>2 rue Hergé, 66750 Saint Cyprien</w:t>
+    </w:r>
+  </w:p>
+  <w:p>
+    <w:pPr>
+      <w:jc w:val="center"/>
+      <w:rPr>
+        <w:rFonts w:ascii="Book Antiqua" w:hAnsi="Book Antiqua"/>
+        <w:color w:val="333399"/>
+        <w:sz w:val="14"/>
+        <w:szCs w:val="14"/>
+      </w:rPr>
+    </w:pPr>
+    <w:r>
+      <w:rPr>
+        <w:rFonts w:ascii="Book Antiqua" w:hAnsi="Book Antiqua"/>
+        <w:color w:val="333399"/>
+        <w:sz w:val="14"/>
+        <w:szCs w:val="14"/>
+      </w:rPr>
+      <w:t>RCS Perpignan B 539 682 187 NAF : 8559A</w:t>
+    </w:r>
+  </w:p>
+  <w:p>
+    <w:pPr>
+      <w:jc w:val="center"/>
+      <w:rPr>
+        <w:rFonts w:ascii="Book Antiqua" w:hAnsi="Book Antiqua"/>
+        <w:color w:val="333399"/>
+        <w:sz w:val="14"/>
+        <w:szCs w:val="14"/>
+      </w:rPr>
+    </w:pPr>
+    <w:r>
+      <w:rPr>
+        <w:rFonts w:ascii="Book Antiqua" w:hAnsi="Book Antiqua"/>
+        <w:color w:val="333399"/>
+        <w:sz w:val="14"/>
+        <w:szCs w:val="14"/>
+      </w:rPr>
+      <w:t>Enregistrée sous le numéro : 91 66 01 620 66</w:t>
+    </w:r>
+  </w:p>
+  <w:p>
+    <w:pPr>
+      <w:jc w:val="center"/>
+      <w:rPr>
+        <w:rFonts w:ascii="Book Antiqua" w:hAnsi="Book Antiqua"/>
+        <w:i/>
+        <w:color w:val="333399"/>
+        <w:sz w:val="14"/>
+        <w:szCs w:val="14"/>
+      </w:rPr>
+    </w:pPr>
+    <w:r>
+      <w:rPr>
+        <w:rFonts w:ascii="Book Antiqua" w:hAnsi="Book Antiqua"/>
+        <w:i/>
+        <w:color w:val="333399"/>
+        <w:sz w:val="14"/>
+        <w:szCs w:val="14"/>
+      </w:rPr>
+      <w:t>Cet enregistrement ne vaut pas agrément de l’Etat</w:t>
     </w:r>
   </w:p>
 </w:ftr>

</xml_diff>

<commit_message>
feat: proposition generation, email templates, fill_proposition.py
</commit_message>
<xml_diff>
--- a/views/PROPOSITION_TEMPLATE.docx
+++ b/views/PROPOSITION_TEMPLATE.docx
@@ -132,7 +132,7 @@
           <w:sz w:val="20"/>
           <w:szCs w:val="20"/>
         </w:rPr>
-        <w:t>Suite à notre échange et à votre évaluation, j’ai le plaisir de vous adresser cette proposition de formation en anglais professionnel conçue spécifiquement pour vos besoins.</w:t>
+        <w:t>{{INTRO_LIGNE}}</w:t>
       </w:r>
     </w:p>
     <w:p>
@@ -410,6 +410,24 @@
                 <w:szCs w:val="18"/>
               </w:rPr>
               <w:t>{{COACHING_HEURES}} heures en visioconférence</w:t>
+            </w:r>
+          </w:p>
+          <w:p>
+            <w:pPr>
+              <w:rPr>
+                <w:rFonts w:ascii="Avenir Next" w:hAnsi="Avenir Next"/>
+              </w:rPr>
+            </w:pPr>
+            <w:r>
+              <w:rPr>
+                <w:rFonts w:ascii="Avenir Next" w:eastAsia="Arial" w:hAnsi="Avenir Next" w:cs="Arial"/>
+                <w:b/>
+                <w:bCs/>
+                <w:color w:val="1A1A1A"/>
+                <w:sz w:val="18"/>
+                <w:szCs w:val="18"/>
+              </w:rPr>
+              <w:t>{{FORMATEUR}}</w:t>
             </w:r>
           </w:p>
         </w:tc>
@@ -834,6 +852,51 @@
     </w:p>
     <w:p>
       <w:pPr>
+        <w:pStyle w:val="ListParagraph"/>
+        <w:numPr>
+          <w:ilvl w:val="0"/>
+          <w:numId w:val="25"/>
+        </w:numPr>
+        <w:spacing w:after="21"/>
+        <w:contextualSpacing w:val="0"/>
+        <w:rPr>
+          <w:rFonts w:ascii="Avenir Next" w:hAnsi="Avenir Next"/>
+        </w:rPr>
+      </w:pPr>
+      <w:r>
+        <w:rPr>
+          <w:rFonts w:ascii="Avenir Next" w:eastAsia="Arial" w:hAnsi="Avenir Next" w:cs="Arial"/>
+          <w:color w:val="1A1A1A"/>
+          <w:sz w:val="20"/>
+          <w:szCs w:val="20"/>
+        </w:rPr>
+        <w:t>{{OBJECTIF_6}}</w:t>
+      </w:r>
+    </w:p>
+    <w:p>
+      <w:pPr>
+        <w:pBdr>
+          <w:bottom w:val="single" w:sz="6" w:space="4" w:color="1F4E79"/>
+        </w:pBdr>
+        <w:spacing w:before="120" w:after="42"/>
+        <w:rPr>
+          <w:rFonts w:ascii="Avenir Next" w:hAnsi="Avenir Next"/>
+        </w:rPr>
+      </w:pPr>
+      <w:r>
+        <w:rPr>
+          <w:rFonts w:ascii="Avenir Next" w:eastAsia="Arial" w:hAnsi="Avenir Next" w:cs="Arial"/>
+          <w:b/>
+          <w:bCs/>
+          <w:color w:val="1F4E79"/>
+          <w:sz w:val="22"/>
+          <w:szCs w:val="22"/>
+        </w:rPr>
+        <w:t>{{ETAPE_2}}</w:t>
+      </w:r>
+    </w:p>
+    <w:p>
+      <w:pPr>
         <w:pBdr>
           <w:bottom w:val="single" w:sz="6" w:space="4" w:color="1F4E79"/>
         </w:pBdr>
@@ -1359,7 +1422,7 @@
       <w:headerReference w:type="first" r:id="rId9"/>
       <w:footerReference w:type="first" r:id="rId10"/>
       <w:pgSz w:w="11906" w:h="16838"/>
-      <w:pgMar w:top="567" w:right="850" w:bottom="1500" w:left="850" w:header="142" w:footer="400" w:gutter="0"/>
+      <w:pgMar w:top="567" w:right="850" w:bottom="2800" w:left="850" w:header="142" w:footer="400" w:gutter="0"/>
       <w:cols w:space="708"/>
       <w:titlePg/>
       <w:docGrid w:linePitch="360"/>

</xml_diff>